<commit_message>
10.10 third: modify all docxs' layout
</commit_message>
<xml_diff>
--- a/习近平新时代思想概论/作业/HW0（思政作用）.docx
+++ b/习近平新时代思想概论/作业/HW0（思政作用）.docx
@@ -4,117 +4,192 @@
   <w:body>
     <w:p>
       <w:pPr>
+        <w:pStyle w:val="a"/>
+        <w:snapToGrid w:val="0"/>
+        <w:spacing w:before="0" w:after="0" w:line="360" w:lineRule="auto"/>
+        <w:ind w:firstLineChars="200" w:firstLine="480"/>
+        <w:jc w:val="both"/>
         <w:rPr>
           <w:rFonts w:hint="eastAsia"/>
         </w:rPr>
       </w:pPr>
       <w:r>
         <w:rPr>
-          <w:rFonts w:hint="eastAsia"/>
+          <w:rFonts w:hint="eastAsia" w:ascii="Times New Roman" w:hAnsi="Times New Roman" w:cs="Times New Roman" w:eastAsia="宋体"/>
+          <w:sz w:val="24"/>
+          <w:szCs w:val="24"/>
         </w:rPr>
         <w:t>我认为</w:t>
       </w:r>
       <w:r>
         <w:t>大学思政课正是现代高等教育中的“大人之学”，其作用可结合《大学》的核心理念来理解：</w:t>
+        <w:rPr>
+          <w:rFonts w:ascii="Times New Roman" w:hAnsi="Times New Roman" w:cs="Times New Roman" w:eastAsia="宋体" w:hint="eastAsia"/>
+          <w:sz w:val="24"/>
+          <w:szCs w:val="24"/>
+        </w:rPr>
       </w:r>
     </w:p>
     <w:p>
       <w:pPr>
-        <w:numPr>
-          <w:ilvl w:val="0"/>
-          <w:numId w:val="2"/>
-        </w:numPr>
+        <w:pStyle w:val="a"/>
+        <w:snapToGrid w:val="0"/>
+        <w:spacing w:before="0" w:after="0" w:line="360" w:lineRule="auto"/>
+        <w:ind w:firstLineChars="200" w:firstLine="480"/>
+        <w:jc w:val="both"/>
         <w:rPr>
           <w:rFonts w:hint="eastAsia"/>
         </w:rPr>
       </w:pPr>
       <w:r>
-        <w:t>“明明德”：帮助学生明德修身</w:t>
+        <w:t xml:space="preserve">1. “明明德”：帮助学生明德修身</w:t>
+        <w:rPr>
+          <w:rFonts w:ascii="Times New Roman" w:hAnsi="Times New Roman" w:cs="Times New Roman" w:eastAsia="宋体" w:hint="eastAsia"/>
+          <w:sz w:val="24"/>
+          <w:szCs w:val="24"/>
+        </w:rPr>
       </w:r>
       <w:r>
         <w:rPr>
-          <w:rFonts w:hint="eastAsia"/>
+          <w:rFonts w:hint="eastAsia" w:ascii="Times New Roman" w:hAnsi="Times New Roman" w:cs="Times New Roman" w:eastAsia="宋体"/>
+          <w:sz w:val="24"/>
+          <w:szCs w:val="24"/>
         </w:rPr>
         <w:t>，</w:t>
       </w:r>
       <w:r>
         <w:t>引导学生认识和弘扬光明德性，树立正确的世界观、人生观、价值观，在多元思潮中守住道德底线。</w:t>
+        <w:rPr>
+          <w:rFonts w:ascii="Times New Roman" w:hAnsi="Times New Roman" w:cs="Times New Roman" w:eastAsia="宋体" w:hint="eastAsia"/>
+          <w:sz w:val="24"/>
+          <w:szCs w:val="24"/>
+        </w:rPr>
       </w:r>
     </w:p>
     <w:p>
       <w:pPr>
-        <w:numPr>
-          <w:ilvl w:val="0"/>
-          <w:numId w:val="2"/>
-        </w:numPr>
+        <w:pStyle w:val="a"/>
+        <w:snapToGrid w:val="0"/>
+        <w:spacing w:before="0" w:after="0" w:line="360" w:lineRule="auto"/>
+        <w:ind w:firstLineChars="200" w:firstLine="480"/>
+        <w:jc w:val="both"/>
         <w:rPr>
           <w:rFonts w:hint="eastAsia"/>
         </w:rPr>
       </w:pPr>
       <w:r>
-        <w:t>“亲民”：培养学生的社会关怀与责任</w:t>
+        <w:t xml:space="preserve">2. “亲民”：培养学生的社会关怀与责任</w:t>
+        <w:rPr>
+          <w:rFonts w:ascii="Times New Roman" w:hAnsi="Times New Roman" w:cs="Times New Roman" w:eastAsia="宋体" w:hint="eastAsia"/>
+          <w:sz w:val="24"/>
+          <w:szCs w:val="24"/>
+        </w:rPr>
       </w:r>
       <w:r>
         <w:rPr>
-          <w:rFonts w:hint="eastAsia"/>
+          <w:rFonts w:hint="eastAsia" w:ascii="Times New Roman" w:hAnsi="Times New Roman" w:cs="Times New Roman" w:eastAsia="宋体"/>
+          <w:sz w:val="24"/>
+          <w:szCs w:val="24"/>
         </w:rPr>
         <w:t>，</w:t>
       </w:r>
       <w:r>
         <w:t>通过国情、法治、伦理等教育，让学生跳出小我，关注社会、服务人民，增强家国情怀和公共责任感。</w:t>
+        <w:rPr>
+          <w:rFonts w:ascii="Times New Roman" w:hAnsi="Times New Roman" w:cs="Times New Roman" w:eastAsia="宋体" w:hint="eastAsia"/>
+          <w:sz w:val="24"/>
+          <w:szCs w:val="24"/>
+        </w:rPr>
       </w:r>
     </w:p>
     <w:p>
       <w:pPr>
-        <w:numPr>
-          <w:ilvl w:val="0"/>
-          <w:numId w:val="2"/>
-        </w:numPr>
+        <w:pStyle w:val="a"/>
+        <w:snapToGrid w:val="0"/>
+        <w:spacing w:before="0" w:after="0" w:line="360" w:lineRule="auto"/>
+        <w:ind w:firstLineChars="200" w:firstLine="480"/>
+        <w:jc w:val="both"/>
         <w:rPr>
           <w:rFonts w:hint="eastAsia"/>
         </w:rPr>
       </w:pPr>
       <w:r>
-        <w:t>“止于至善”：坚定</w:t>
+        <w:t xml:space="preserve">3. “止于至善”：坚定</w:t>
+        <w:rPr>
+          <w:rFonts w:ascii="Times New Roman" w:hAnsi="Times New Roman" w:cs="Times New Roman" w:eastAsia="宋体" w:hint="eastAsia"/>
+          <w:sz w:val="24"/>
+          <w:szCs w:val="24"/>
+        </w:rPr>
       </w:r>
       <w:r>
         <w:rPr>
-          <w:rFonts w:hint="eastAsia"/>
+          <w:rFonts w:hint="eastAsia" w:ascii="Times New Roman" w:hAnsi="Times New Roman" w:cs="Times New Roman" w:eastAsia="宋体"/>
+          <w:sz w:val="24"/>
+          <w:szCs w:val="24"/>
         </w:rPr>
         <w:t>学生的</w:t>
       </w:r>
       <w:r>
         <w:t>理想与价值追求</w:t>
+        <w:rPr>
+          <w:rFonts w:ascii="Times New Roman" w:hAnsi="Times New Roman" w:cs="Times New Roman" w:eastAsia="宋体" w:hint="eastAsia"/>
+          <w:sz w:val="24"/>
+          <w:szCs w:val="24"/>
+        </w:rPr>
       </w:r>
       <w:r>
         <w:rPr>
-          <w:rFonts w:hint="eastAsia"/>
+          <w:rFonts w:hint="eastAsia" w:ascii="Times New Roman" w:hAnsi="Times New Roman" w:cs="Times New Roman" w:eastAsia="宋体"/>
+          <w:sz w:val="24"/>
+          <w:szCs w:val="24"/>
         </w:rPr>
         <w:t>，</w:t>
       </w:r>
       <w:r>
         <w:t>引导学生追求更高的精神境界和人生目标，把个人理想融入国家发展，不断趋向完善。</w:t>
+        <w:rPr>
+          <w:rFonts w:ascii="Times New Roman" w:hAnsi="Times New Roman" w:cs="Times New Roman" w:eastAsia="宋体" w:hint="eastAsia"/>
+          <w:sz w:val="24"/>
+          <w:szCs w:val="24"/>
+        </w:rPr>
       </w:r>
     </w:p>
     <w:p>
       <w:pPr>
+        <w:pStyle w:val="a"/>
+        <w:snapToGrid w:val="0"/>
+        <w:spacing w:before="0" w:after="0" w:line="360" w:lineRule="auto"/>
+        <w:ind w:firstLineChars="200" w:firstLine="480"/>
+        <w:jc w:val="both"/>
         <w:rPr>
           <w:rFonts w:hint="eastAsia"/>
         </w:rPr>
       </w:pPr>
       <w:r>
         <w:t>总之，大学思政课可视为现代版的“大学之道”，其核心作用是帮助学生完成从“修身”到“济世”的成长，使个人发展与时代使命相统一。</w:t>
+        <w:rPr>
+          <w:rFonts w:ascii="Times New Roman" w:hAnsi="Times New Roman" w:cs="Times New Roman" w:eastAsia="宋体" w:hint="eastAsia"/>
+          <w:sz w:val="24"/>
+          <w:szCs w:val="24"/>
+        </w:rPr>
       </w:r>
     </w:p>
     <w:p>
       <w:pPr>
+        <w:pStyle w:val="a"/>
+        <w:snapToGrid w:val="0"/>
+        <w:spacing w:before="0" w:after="0" w:line="360" w:lineRule="auto"/>
+        <w:ind w:firstLineChars="200" w:firstLine="480"/>
+        <w:jc w:val="both"/>
         <w:rPr>
           <w:rFonts w:hint="eastAsia"/>
         </w:rPr>
       </w:pPr>
       <w:r>
         <w:rPr>
-          <w:rFonts w:hint="eastAsia"/>
+          <w:rFonts w:hint="eastAsia" w:ascii="Times New Roman" w:hAnsi="Times New Roman" w:cs="Times New Roman" w:eastAsia="宋体"/>
+          <w:sz w:val="24"/>
+          <w:szCs w:val="24"/>
         </w:rPr>
         <w:t>（思政课的作用）</w:t>
       </w:r>
@@ -375,9 +450,9 @@
   <w:docDefaults>
     <w:rPrDefault>
       <w:rPr>
-        <w:rFonts w:asciiTheme="minorHAnsi" w:eastAsiaTheme="minorEastAsia" w:hAnsiTheme="minorHAnsi" w:cstheme="minorBidi"/>
+        <w:rFonts w:asciiTheme="minorHAnsi" w:eastAsiaTheme="minorEastAsia" w:hAnsiTheme="minorHAnsi" w:cstheme="minorBidi" w:ascii="Times New Roman" w:hAnsi="Times New Roman" w:cs="Times New Roman" w:eastAsia="宋体" w:hint="eastAsia"/>
         <w:kern w:val="2"/>
-        <w:sz w:val="22"/>
+        <w:sz w:val="24"/>
         <w:szCs w:val="24"/>
         <w:lang w:val="en-US" w:eastAsia="zh-CN" w:bidi="ar-SA"/>
         <w14:ligatures w14:val="standardContextual"/>
@@ -385,7 +460,7 @@
     </w:rPrDefault>
     <w:pPrDefault>
       <w:pPr>
-        <w:spacing w:after="160" w:line="278" w:lineRule="auto"/>
+        <w:spacing w:after="0" w:line="360" w:lineRule="auto" w:before="0"/>
       </w:pPr>
     </w:pPrDefault>
   </w:docDefaults>
@@ -772,7 +847,13 @@
     <w:qFormat/>
     <w:pPr>
       <w:widowControl w:val="0"/>
+      <w:spacing w:before="0" w:after="0" w:line="360" w:lineRule="auto"/>
     </w:pPr>
+    <w:rPr>
+      <w:rFonts w:ascii="Times New Roman" w:hAnsi="Times New Roman" w:cs="Times New Roman" w:eastAsia="宋体" w:hint="eastAsia"/>
+      <w:sz w:val="24"/>
+      <w:szCs w:val="24"/>
+    </w:rPr>
   </w:style>
   <w:style w:type="paragraph" w:styleId="1">
     <w:name w:val="heading 1"/>

</xml_diff>

<commit_message>
Use DSH to update textbook and HWs; Use DSH to adjust layout of HWs
</commit_message>
<xml_diff>
--- a/习近平新时代思想概论/作业/HW0（思政作用）.docx
+++ b/习近平新时代思想概论/作业/HW0（思政作用）.docx
@@ -6,8 +6,8 @@
       <w:pPr>
         <w:pStyle w:val="a"/>
         <w:snapToGrid w:val="0"/>
-        <w:spacing w:before="0" w:after="0" w:line="360" w:lineRule="auto"/>
-        <w:ind w:firstLineChars="200" w:firstLine="480"/>
+        <w:spacing w:before="0" w:after="0" w:line="300" w:lineRule="auto"/>
+        <w:ind w:firstLineChars="200" w:firstLine="420"/>
         <w:jc w:val="both"/>
         <w:rPr>
           <w:rFonts w:hint="eastAsia"/>
@@ -16,170 +16,170 @@
       <w:r>
         <w:rPr>
           <w:rFonts w:hint="eastAsia" w:ascii="Times New Roman" w:hAnsi="Times New Roman" w:cs="Times New Roman" w:eastAsia="宋体"/>
-          <w:sz w:val="24"/>
-          <w:szCs w:val="24"/>
+          <w:sz w:val="21"/>
+          <w:szCs w:val="21"/>
         </w:rPr>
         <w:t>我认为</w:t>
       </w:r>
       <w:r>
+        <w:rPr>
+          <w:rFonts w:ascii="Times New Roman" w:hAnsi="Times New Roman" w:cs="Times New Roman" w:eastAsia="宋体" w:hint="eastAsia"/>
+          <w:sz w:val="21"/>
+          <w:szCs w:val="21"/>
+        </w:rPr>
         <w:t>大学思政课正是现代高等教育中的“大人之学”，其作用可结合《大学》的核心理念来理解：</w:t>
-        <w:rPr>
-          <w:rFonts w:ascii="Times New Roman" w:hAnsi="Times New Roman" w:cs="Times New Roman" w:eastAsia="宋体" w:hint="eastAsia"/>
-          <w:sz w:val="24"/>
-          <w:szCs w:val="24"/>
-        </w:rPr>
       </w:r>
     </w:p>
     <w:p>
       <w:pPr>
         <w:pStyle w:val="a"/>
         <w:snapToGrid w:val="0"/>
-        <w:spacing w:before="0" w:after="0" w:line="360" w:lineRule="auto"/>
-        <w:ind w:firstLineChars="200" w:firstLine="480"/>
+        <w:spacing w:before="0" w:after="0" w:line="300" w:lineRule="auto"/>
+        <w:ind w:firstLineChars="200" w:firstLine="420"/>
         <w:jc w:val="both"/>
         <w:rPr>
           <w:rFonts w:hint="eastAsia"/>
         </w:rPr>
       </w:pPr>
       <w:r>
+        <w:rPr>
+          <w:rFonts w:ascii="Times New Roman" w:hAnsi="Times New Roman" w:cs="Times New Roman" w:eastAsia="宋体" w:hint="eastAsia"/>
+          <w:sz w:val="21"/>
+          <w:szCs w:val="21"/>
+        </w:rPr>
         <w:t xml:space="preserve">1. “明明德”：帮助学生明德修身</w:t>
-        <w:rPr>
-          <w:rFonts w:ascii="Times New Roman" w:hAnsi="Times New Roman" w:cs="Times New Roman" w:eastAsia="宋体" w:hint="eastAsia"/>
-          <w:sz w:val="24"/>
-          <w:szCs w:val="24"/>
-        </w:rPr>
       </w:r>
       <w:r>
         <w:rPr>
           <w:rFonts w:hint="eastAsia" w:ascii="Times New Roman" w:hAnsi="Times New Roman" w:cs="Times New Roman" w:eastAsia="宋体"/>
-          <w:sz w:val="24"/>
-          <w:szCs w:val="24"/>
+          <w:sz w:val="21"/>
+          <w:szCs w:val="21"/>
         </w:rPr>
         <w:t>，</w:t>
       </w:r>
       <w:r>
+        <w:rPr>
+          <w:rFonts w:ascii="Times New Roman" w:hAnsi="Times New Roman" w:cs="Times New Roman" w:eastAsia="宋体" w:hint="eastAsia"/>
+          <w:sz w:val="21"/>
+          <w:szCs w:val="21"/>
+        </w:rPr>
         <w:t>引导学生认识和弘扬光明德性，树立正确的世界观、人生观、价值观，在多元思潮中守住道德底线。</w:t>
-        <w:rPr>
-          <w:rFonts w:ascii="Times New Roman" w:hAnsi="Times New Roman" w:cs="Times New Roman" w:eastAsia="宋体" w:hint="eastAsia"/>
-          <w:sz w:val="24"/>
-          <w:szCs w:val="24"/>
-        </w:rPr>
       </w:r>
     </w:p>
     <w:p>
       <w:pPr>
         <w:pStyle w:val="a"/>
         <w:snapToGrid w:val="0"/>
-        <w:spacing w:before="0" w:after="0" w:line="360" w:lineRule="auto"/>
-        <w:ind w:firstLineChars="200" w:firstLine="480"/>
+        <w:spacing w:before="0" w:after="0" w:line="300" w:lineRule="auto"/>
+        <w:ind w:firstLineChars="200" w:firstLine="420"/>
         <w:jc w:val="both"/>
         <w:rPr>
           <w:rFonts w:hint="eastAsia"/>
         </w:rPr>
       </w:pPr>
       <w:r>
+        <w:rPr>
+          <w:rFonts w:ascii="Times New Roman" w:hAnsi="Times New Roman" w:cs="Times New Roman" w:eastAsia="宋体" w:hint="eastAsia"/>
+          <w:sz w:val="21"/>
+          <w:szCs w:val="21"/>
+        </w:rPr>
         <w:t xml:space="preserve">2. “亲民”：培养学生的社会关怀与责任</w:t>
-        <w:rPr>
-          <w:rFonts w:ascii="Times New Roman" w:hAnsi="Times New Roman" w:cs="Times New Roman" w:eastAsia="宋体" w:hint="eastAsia"/>
-          <w:sz w:val="24"/>
-          <w:szCs w:val="24"/>
-        </w:rPr>
       </w:r>
       <w:r>
         <w:rPr>
           <w:rFonts w:hint="eastAsia" w:ascii="Times New Roman" w:hAnsi="Times New Roman" w:cs="Times New Roman" w:eastAsia="宋体"/>
-          <w:sz w:val="24"/>
-          <w:szCs w:val="24"/>
+          <w:sz w:val="21"/>
+          <w:szCs w:val="21"/>
         </w:rPr>
         <w:t>，</w:t>
       </w:r>
       <w:r>
+        <w:rPr>
+          <w:rFonts w:ascii="Times New Roman" w:hAnsi="Times New Roman" w:cs="Times New Roman" w:eastAsia="宋体" w:hint="eastAsia"/>
+          <w:sz w:val="21"/>
+          <w:szCs w:val="21"/>
+        </w:rPr>
         <w:t>通过国情、法治、伦理等教育，让学生跳出小我，关注社会、服务人民，增强家国情怀和公共责任感。</w:t>
-        <w:rPr>
-          <w:rFonts w:ascii="Times New Roman" w:hAnsi="Times New Roman" w:cs="Times New Roman" w:eastAsia="宋体" w:hint="eastAsia"/>
-          <w:sz w:val="24"/>
-          <w:szCs w:val="24"/>
-        </w:rPr>
       </w:r>
     </w:p>
     <w:p>
       <w:pPr>
         <w:pStyle w:val="a"/>
         <w:snapToGrid w:val="0"/>
-        <w:spacing w:before="0" w:after="0" w:line="360" w:lineRule="auto"/>
-        <w:ind w:firstLineChars="200" w:firstLine="480"/>
+        <w:spacing w:before="0" w:after="0" w:line="300" w:lineRule="auto"/>
+        <w:ind w:firstLineChars="200" w:firstLine="420"/>
         <w:jc w:val="both"/>
         <w:rPr>
           <w:rFonts w:hint="eastAsia"/>
         </w:rPr>
       </w:pPr>
       <w:r>
+        <w:rPr>
+          <w:rFonts w:ascii="Times New Roman" w:hAnsi="Times New Roman" w:cs="Times New Roman" w:eastAsia="宋体" w:hint="eastAsia"/>
+          <w:sz w:val="21"/>
+          <w:szCs w:val="21"/>
+        </w:rPr>
         <w:t xml:space="preserve">3. “止于至善”：坚定</w:t>
-        <w:rPr>
-          <w:rFonts w:ascii="Times New Roman" w:hAnsi="Times New Roman" w:cs="Times New Roman" w:eastAsia="宋体" w:hint="eastAsia"/>
-          <w:sz w:val="24"/>
-          <w:szCs w:val="24"/>
-        </w:rPr>
       </w:r>
       <w:r>
         <w:rPr>
           <w:rFonts w:hint="eastAsia" w:ascii="Times New Roman" w:hAnsi="Times New Roman" w:cs="Times New Roman" w:eastAsia="宋体"/>
-          <w:sz w:val="24"/>
-          <w:szCs w:val="24"/>
+          <w:sz w:val="21"/>
+          <w:szCs w:val="21"/>
         </w:rPr>
         <w:t>学生的</w:t>
       </w:r>
       <w:r>
+        <w:rPr>
+          <w:rFonts w:ascii="Times New Roman" w:hAnsi="Times New Roman" w:cs="Times New Roman" w:eastAsia="宋体" w:hint="eastAsia"/>
+          <w:sz w:val="21"/>
+          <w:szCs w:val="21"/>
+        </w:rPr>
         <w:t>理想与价值追求</w:t>
-        <w:rPr>
-          <w:rFonts w:ascii="Times New Roman" w:hAnsi="Times New Roman" w:cs="Times New Roman" w:eastAsia="宋体" w:hint="eastAsia"/>
-          <w:sz w:val="24"/>
-          <w:szCs w:val="24"/>
-        </w:rPr>
       </w:r>
       <w:r>
         <w:rPr>
           <w:rFonts w:hint="eastAsia" w:ascii="Times New Roman" w:hAnsi="Times New Roman" w:cs="Times New Roman" w:eastAsia="宋体"/>
-          <w:sz w:val="24"/>
-          <w:szCs w:val="24"/>
+          <w:sz w:val="21"/>
+          <w:szCs w:val="21"/>
         </w:rPr>
         <w:t>，</w:t>
       </w:r>
       <w:r>
+        <w:rPr>
+          <w:rFonts w:ascii="Times New Roman" w:hAnsi="Times New Roman" w:cs="Times New Roman" w:eastAsia="宋体" w:hint="eastAsia"/>
+          <w:sz w:val="21"/>
+          <w:szCs w:val="21"/>
+        </w:rPr>
         <w:t>引导学生追求更高的精神境界和人生目标，把个人理想融入国家发展，不断趋向完善。</w:t>
-        <w:rPr>
-          <w:rFonts w:ascii="Times New Roman" w:hAnsi="Times New Roman" w:cs="Times New Roman" w:eastAsia="宋体" w:hint="eastAsia"/>
-          <w:sz w:val="24"/>
-          <w:szCs w:val="24"/>
-        </w:rPr>
       </w:r>
     </w:p>
     <w:p>
       <w:pPr>
         <w:pStyle w:val="a"/>
         <w:snapToGrid w:val="0"/>
-        <w:spacing w:before="0" w:after="0" w:line="360" w:lineRule="auto"/>
-        <w:ind w:firstLineChars="200" w:firstLine="480"/>
+        <w:spacing w:before="0" w:after="0" w:line="300" w:lineRule="auto"/>
+        <w:ind w:firstLineChars="200" w:firstLine="420"/>
         <w:jc w:val="both"/>
         <w:rPr>
           <w:rFonts w:hint="eastAsia"/>
         </w:rPr>
       </w:pPr>
       <w:r>
+        <w:rPr>
+          <w:rFonts w:ascii="Times New Roman" w:hAnsi="Times New Roman" w:cs="Times New Roman" w:eastAsia="宋体" w:hint="eastAsia"/>
+          <w:sz w:val="21"/>
+          <w:szCs w:val="21"/>
+        </w:rPr>
         <w:t>总之，大学思政课可视为现代版的“大学之道”，其核心作用是帮助学生完成从“修身”到“济世”的成长，使个人发展与时代使命相统一。</w:t>
-        <w:rPr>
-          <w:rFonts w:ascii="Times New Roman" w:hAnsi="Times New Roman" w:cs="Times New Roman" w:eastAsia="宋体" w:hint="eastAsia"/>
-          <w:sz w:val="24"/>
-          <w:szCs w:val="24"/>
-        </w:rPr>
       </w:r>
     </w:p>
     <w:p>
       <w:pPr>
         <w:pStyle w:val="a"/>
         <w:snapToGrid w:val="0"/>
-        <w:spacing w:before="0" w:after="0" w:line="360" w:lineRule="auto"/>
-        <w:ind w:firstLineChars="200" w:firstLine="480"/>
+        <w:spacing w:before="0" w:after="0" w:line="300" w:lineRule="auto"/>
+        <w:ind w:firstLineChars="200" w:firstLine="420"/>
         <w:jc w:val="both"/>
         <w:rPr>
           <w:rFonts w:hint="eastAsia"/>
@@ -188,8 +188,8 @@
       <w:r>
         <w:rPr>
           <w:rFonts w:hint="eastAsia" w:ascii="Times New Roman" w:hAnsi="Times New Roman" w:cs="Times New Roman" w:eastAsia="宋体"/>
-          <w:sz w:val="24"/>
-          <w:szCs w:val="24"/>
+          <w:sz w:val="21"/>
+          <w:szCs w:val="21"/>
         </w:rPr>
         <w:t>（思政课的作用）</w:t>
       </w:r>
@@ -452,8 +452,8 @@
       <w:rPr>
         <w:rFonts w:asciiTheme="minorHAnsi" w:eastAsiaTheme="minorEastAsia" w:hAnsiTheme="minorHAnsi" w:cstheme="minorBidi" w:ascii="Times New Roman" w:hAnsi="Times New Roman" w:cs="Times New Roman" w:eastAsia="宋体" w:hint="eastAsia"/>
         <w:kern w:val="2"/>
-        <w:sz w:val="24"/>
-        <w:szCs w:val="24"/>
+        <w:sz w:val="21"/>
+        <w:szCs w:val="21"/>
         <w:lang w:val="en-US" w:eastAsia="zh-CN" w:bidi="ar-SA"/>
         <w14:ligatures w14:val="standardContextual"/>
       </w:rPr>
@@ -851,8 +851,8 @@
     </w:pPr>
     <w:rPr>
       <w:rFonts w:ascii="Times New Roman" w:hAnsi="Times New Roman" w:cs="Times New Roman" w:eastAsia="宋体" w:hint="eastAsia"/>
-      <w:sz w:val="24"/>
-      <w:szCs w:val="24"/>
+      <w:sz w:val="21"/>
+      <w:szCs w:val="21"/>
     </w:rPr>
   </w:style>
   <w:style w:type="paragraph" w:styleId="1">

</xml_diff>

<commit_message>
10.23 first: Use DSH to modify HWs slightly
</commit_message>
<xml_diff>
--- a/习近平新时代思想概论/作业/HW0（思政作用）.docx
+++ b/习近平新时代思想概论/作业/HW0（思政作用）.docx
@@ -19,15 +19,7 @@
           <w:sz w:val="21"/>
           <w:szCs w:val="21"/>
         </w:rPr>
-        <w:t>我认为</w:t>
-      </w:r>
-      <w:r>
-        <w:rPr>
-          <w:rFonts w:ascii="Times New Roman" w:hAnsi="Times New Roman" w:cs="Times New Roman" w:eastAsia="宋体" w:hint="eastAsia"/>
-          <w:sz w:val="21"/>
-          <w:szCs w:val="21"/>
-        </w:rPr>
-        <w:t>大学思政课正是现代高等教育中的“大人之学”，其作用可结合《大学》的核心理念来理解：</w:t>
+        <w:t xml:space="preserve">思政课在高等教育里到底占什么位置，我更愿意用《大学》里“大学之道”这条线索来梳理，理由有三：</w:t>
       </w:r>
     </w:p>
     <w:p>
@@ -47,23 +39,7 @@
           <w:sz w:val="21"/>
           <w:szCs w:val="21"/>
         </w:rPr>
-        <w:t xml:space="preserve">1. “明明德”：帮助学生明德修身</w:t>
-      </w:r>
-      <w:r>
-        <w:rPr>
-          <w:rFonts w:hint="eastAsia" w:ascii="Times New Roman" w:hAnsi="Times New Roman" w:cs="Times New Roman" w:eastAsia="宋体"/>
-          <w:sz w:val="21"/>
-          <w:szCs w:val="21"/>
-        </w:rPr>
-        <w:t>，</w:t>
-      </w:r>
-      <w:r>
-        <w:rPr>
-          <w:rFonts w:ascii="Times New Roman" w:hAnsi="Times New Roman" w:cs="Times New Roman" w:eastAsia="宋体" w:hint="eastAsia"/>
-          <w:sz w:val="21"/>
-          <w:szCs w:val="21"/>
-        </w:rPr>
-        <w:t>引导学生认识和弘扬光明德性，树立正确的世界观、人生观、价值观，在多元思潮中守住道德底线。</w:t>
+        <w:t xml:space="preserve">1. “明明德”——落点在“修身”。课程首先解决的是价值坐标问题：在信息芜杂、观点对撞的环境里，学生能不能分辨是非、守住底线，能不能把个人品格的打磨当成一件正经事来做。</w:t>
       </w:r>
     </w:p>
     <w:p>
@@ -83,23 +59,7 @@
           <w:sz w:val="21"/>
           <w:szCs w:val="21"/>
         </w:rPr>
-        <w:t xml:space="preserve">2. “亲民”：培养学生的社会关怀与责任</w:t>
-      </w:r>
-      <w:r>
-        <w:rPr>
-          <w:rFonts w:hint="eastAsia" w:ascii="Times New Roman" w:hAnsi="Times New Roman" w:cs="Times New Roman" w:eastAsia="宋体"/>
-          <w:sz w:val="21"/>
-          <w:szCs w:val="21"/>
-        </w:rPr>
-        <w:t>，</w:t>
-      </w:r>
-      <w:r>
-        <w:rPr>
-          <w:rFonts w:ascii="Times New Roman" w:hAnsi="Times New Roman" w:cs="Times New Roman" w:eastAsia="宋体" w:hint="eastAsia"/>
-          <w:sz w:val="21"/>
-          <w:szCs w:val="21"/>
-        </w:rPr>
-        <w:t>通过国情、法治、伦理等教育，让学生跳出小我，关注社会、服务人民，增强家国情怀和公共责任感。</w:t>
+        <w:t xml:space="preserve">2. “亲民”——落点在“入世”。国情、法治、伦理这几块内容，本质上是在把学生从自己的小圈子里拽出来，让他看见人和社会的连接：既要知道这个国家怎么运转，也要愿意为它承担一部分责任。</w:t>
       </w:r>
     </w:p>
     <w:p>
@@ -119,39 +79,7 @@
           <w:sz w:val="21"/>
           <w:szCs w:val="21"/>
         </w:rPr>
-        <w:t xml:space="preserve">3. “止于至善”：坚定</w:t>
-      </w:r>
-      <w:r>
-        <w:rPr>
-          <w:rFonts w:hint="eastAsia" w:ascii="Times New Roman" w:hAnsi="Times New Roman" w:cs="Times New Roman" w:eastAsia="宋体"/>
-          <w:sz w:val="21"/>
-          <w:szCs w:val="21"/>
-        </w:rPr>
-        <w:t>学生的</w:t>
-      </w:r>
-      <w:r>
-        <w:rPr>
-          <w:rFonts w:ascii="Times New Roman" w:hAnsi="Times New Roman" w:cs="Times New Roman" w:eastAsia="宋体" w:hint="eastAsia"/>
-          <w:sz w:val="21"/>
-          <w:szCs w:val="21"/>
-        </w:rPr>
-        <w:t>理想与价值追求</w:t>
-      </w:r>
-      <w:r>
-        <w:rPr>
-          <w:rFonts w:hint="eastAsia" w:ascii="Times New Roman" w:hAnsi="Times New Roman" w:cs="Times New Roman" w:eastAsia="宋体"/>
-          <w:sz w:val="21"/>
-          <w:szCs w:val="21"/>
-        </w:rPr>
-        <w:t>，</w:t>
-      </w:r>
-      <w:r>
-        <w:rPr>
-          <w:rFonts w:ascii="Times New Roman" w:hAnsi="Times New Roman" w:cs="Times New Roman" w:eastAsia="宋体" w:hint="eastAsia"/>
-          <w:sz w:val="21"/>
-          <w:szCs w:val="21"/>
-        </w:rPr>
-        <w:t>引导学生追求更高的精神境界和人生目标，把个人理想融入国家发展，不断趋向完善。</w:t>
+        <w:t xml:space="preserve">3. “止于至善”——落点在“向上”。理想教育容易被讲成空话，但它真实的作用是给一个够得着的上限：把个人追求放进国家发展的坐标系，人才不至于在“躺”与“卷”之间反复横跳。</w:t>
       </w:r>
     </w:p>
     <w:p>
@@ -171,7 +99,7 @@
           <w:sz w:val="21"/>
           <w:szCs w:val="21"/>
         </w:rPr>
-        <w:t>总之，大学思政课可视为现代版的“大学之道”，其核心作用是帮助学生完成从“修身”到“济世”的成长，使个人发展与时代使命相统一。</w:t>
+        <w:t xml:space="preserve">所以结论是：思政课不是一门要背多少条的课，它更接近一次“成人”的引导——先管好自己，再读懂社会，最后找到值得投入的方向。</w:t>
       </w:r>
     </w:p>
     <w:p>

</xml_diff>